<commit_message>
feat: enhance project showcase with bilingual video presentations
</commit_message>
<xml_diff>
--- a/public/documents/Resume_Mike_Vorobyev.docx
+++ b/public/documents/Resume_Mike_Vorobyev.docx
@@ -999,7 +999,42 @@
           <w:shd w:val="clear" w:color="auto" w:fill="FFFFFF"/>
           <w:lang w:val="en-US"/>
         </w:rPr>
-        <w:t xml:space="preserve"> React, JavaScript, </w:t>
+        <w:t xml:space="preserve"> React, </w:t>
+      </w:r>
+      <w:proofErr w:type="spellStart"/>
+      <w:r>
+        <w:rPr>
+          <w:rFonts w:ascii="Arial" w:hAnsi="Arial" w:cs="Arial"/>
+          <w:color w:val="000000"/>
+          <w:sz w:val="32"/>
+          <w:szCs w:val="32"/>
+          <w:shd w:val="clear" w:color="auto" w:fill="FFFFFF"/>
+          <w:lang w:val="en-US"/>
+        </w:rPr>
+        <w:t>Vite</w:t>
+      </w:r>
+      <w:proofErr w:type="spellEnd"/>
+      <w:r>
+        <w:rPr>
+          <w:rFonts w:ascii="Arial" w:hAnsi="Arial" w:cs="Arial"/>
+          <w:color w:val="000000"/>
+          <w:sz w:val="32"/>
+          <w:szCs w:val="32"/>
+          <w:shd w:val="clear" w:color="auto" w:fill="FFFFFF"/>
+          <w:lang w:val="en-US"/>
+        </w:rPr>
+        <w:t xml:space="preserve">, </w:t>
+      </w:r>
+      <w:r>
+        <w:rPr>
+          <w:rFonts w:ascii="Arial" w:hAnsi="Arial" w:cs="Arial"/>
+          <w:color w:val="000000"/>
+          <w:sz w:val="32"/>
+          <w:szCs w:val="32"/>
+          <w:shd w:val="clear" w:color="auto" w:fill="FFFFFF"/>
+          <w:lang w:val="en-US"/>
+        </w:rPr>
+        <w:t xml:space="preserve">JavaScript, </w:t>
       </w:r>
       <w:proofErr w:type="spellStart"/>
       <w:r>
@@ -1210,7 +1245,64 @@
           <w:shd w:val="clear" w:color="auto" w:fill="FFFFFF"/>
           <w:lang w:val="en-US"/>
         </w:rPr>
-        <w:t xml:space="preserve">React • JavaScript • </w:t>
+        <w:t>React</w:t>
+      </w:r>
+      <w:r>
+        <w:rPr>
+          <w:rFonts w:ascii="Arial" w:hAnsi="Arial" w:cs="Arial"/>
+          <w:color w:val="000000"/>
+          <w:sz w:val="32"/>
+          <w:szCs w:val="32"/>
+          <w:shd w:val="clear" w:color="auto" w:fill="FFFFFF"/>
+          <w:lang w:val="en-US"/>
+        </w:rPr>
+        <w:t xml:space="preserve"> • </w:t>
+      </w:r>
+      <w:proofErr w:type="spellStart"/>
+      <w:r>
+        <w:rPr>
+          <w:rFonts w:ascii="Arial" w:hAnsi="Arial" w:cs="Arial"/>
+          <w:color w:val="000000"/>
+          <w:sz w:val="32"/>
+          <w:szCs w:val="32"/>
+          <w:shd w:val="clear" w:color="auto" w:fill="FFFFFF"/>
+          <w:lang w:val="en-US"/>
+        </w:rPr>
+        <w:t>Vite</w:t>
+      </w:r>
+      <w:proofErr w:type="spellEnd"/>
+      <w:r>
+        <w:rPr>
+          <w:rFonts w:ascii="Arial" w:hAnsi="Arial" w:cs="Arial"/>
+          <w:color w:val="000000"/>
+          <w:sz w:val="32"/>
+          <w:szCs w:val="32"/>
+          <w:shd w:val="clear" w:color="auto" w:fill="FFFFFF"/>
+          <w:lang w:val="en-US"/>
+        </w:rPr>
+        <w:t xml:space="preserve"> • </w:t>
+      </w:r>
+      <w:r>
+        <w:rPr>
+          <w:rFonts w:ascii="Arial" w:hAnsi="Arial" w:cs="Arial"/>
+          <w:color w:val="000000"/>
+          <w:sz w:val="32"/>
+          <w:szCs w:val="32"/>
+          <w:shd w:val="clear" w:color="auto" w:fill="FFFFFF"/>
+          <w:lang w:val="en-US"/>
+        </w:rPr>
+        <w:t>JavaScript</w:t>
+      </w:r>
+      <w:r>
+        <w:rPr>
+          <w:rFonts w:ascii="Arial" w:hAnsi="Arial" w:cs="Arial"/>
+          <w:color w:val="000000"/>
+          <w:sz w:val="32"/>
+          <w:szCs w:val="32"/>
+          <w:shd w:val="clear" w:color="auto" w:fill="FFFFFF"/>
+          <w:lang w:val="en-US"/>
+        </w:rPr>
+        <w:t xml:space="preserve"> • </w:t>
       </w:r>
       <w:proofErr w:type="spellStart"/>
       <w:r>
@@ -1246,6 +1338,109 @@
           <w:shd w:val="clear" w:color="auto" w:fill="FFFFFF"/>
           <w:lang w:val="en-US"/>
         </w:rPr>
+        <w:t>Zod</w:t>
+      </w:r>
+      <w:proofErr w:type="spellEnd"/>
+      <w:r>
+        <w:rPr>
+          <w:rFonts w:ascii="Arial" w:hAnsi="Arial" w:cs="Arial"/>
+          <w:color w:val="000000"/>
+          <w:sz w:val="32"/>
+          <w:szCs w:val="32"/>
+          <w:shd w:val="clear" w:color="auto" w:fill="FFFFFF"/>
+          <w:lang w:val="en-US"/>
+        </w:rPr>
+        <w:t xml:space="preserve"> </w:t>
+      </w:r>
+      <w:r>
+        <w:rPr>
+          <w:rFonts w:ascii="Arial" w:hAnsi="Arial" w:cs="Arial"/>
+          <w:color w:val="000000"/>
+          <w:sz w:val="32"/>
+          <w:szCs w:val="32"/>
+          <w:shd w:val="clear" w:color="auto" w:fill="FFFFFF"/>
+          <w:lang w:val="en-US"/>
+        </w:rPr>
+        <w:t>•</w:t>
+      </w:r>
+      <w:r>
+        <w:rPr>
+          <w:rFonts w:ascii="Arial" w:hAnsi="Arial" w:cs="Arial"/>
+          <w:color w:val="000000"/>
+          <w:sz w:val="32"/>
+          <w:szCs w:val="32"/>
+          <w:shd w:val="clear" w:color="auto" w:fill="FFFFFF"/>
+          <w:lang w:val="en-US"/>
+        </w:rPr>
+        <w:t xml:space="preserve"> </w:t>
+      </w:r>
+      <w:proofErr w:type="spellStart"/>
+      <w:r>
+        <w:rPr>
+          <w:rFonts w:ascii="Arial" w:hAnsi="Arial" w:cs="Arial"/>
+          <w:color w:val="000000"/>
+          <w:sz w:val="32"/>
+          <w:szCs w:val="32"/>
+          <w:shd w:val="clear" w:color="auto" w:fill="FFFFFF"/>
+          <w:lang w:val="en-US"/>
+        </w:rPr>
+        <w:t>TanStack</w:t>
+      </w:r>
+      <w:proofErr w:type="spellEnd"/>
+      <w:r>
+        <w:rPr>
+          <w:rFonts w:ascii="Arial" w:hAnsi="Arial" w:cs="Arial"/>
+          <w:color w:val="000000"/>
+          <w:sz w:val="32"/>
+          <w:szCs w:val="32"/>
+          <w:shd w:val="clear" w:color="auto" w:fill="FFFFFF"/>
+          <w:lang w:val="en-US"/>
+        </w:rPr>
+        <w:t xml:space="preserve"> Router</w:t>
+      </w:r>
+      <w:r>
+        <w:rPr>
+          <w:rFonts w:ascii="Arial" w:hAnsi="Arial" w:cs="Arial"/>
+          <w:color w:val="000000"/>
+          <w:sz w:val="32"/>
+          <w:szCs w:val="32"/>
+          <w:shd w:val="clear" w:color="auto" w:fill="FFFFFF"/>
+          <w:lang w:val="en-US"/>
+        </w:rPr>
+        <w:t xml:space="preserve"> </w:t>
+      </w:r>
+      <w:r>
+        <w:rPr>
+          <w:rFonts w:ascii="Arial" w:hAnsi="Arial" w:cs="Arial"/>
+          <w:color w:val="000000"/>
+          <w:sz w:val="32"/>
+          <w:szCs w:val="32"/>
+          <w:shd w:val="clear" w:color="auto" w:fill="FFFFFF"/>
+          <w:lang w:val="en-US"/>
+        </w:rPr>
+        <w:t>•</w:t>
+      </w:r>
+      <w:r>
+        <w:rPr>
+          <w:rFonts w:ascii="Arial" w:hAnsi="Arial" w:cs="Arial"/>
+          <w:color w:val="000000"/>
+          <w:sz w:val="32"/>
+          <w:szCs w:val="32"/>
+          <w:shd w:val="clear" w:color="auto" w:fill="FFFFFF"/>
+          <w:lang w:val="en-US"/>
+        </w:rPr>
+        <w:t xml:space="preserve"> </w:t>
+      </w:r>
+      <w:proofErr w:type="spellStart"/>
+      <w:r>
+        <w:rPr>
+          <w:rFonts w:ascii="Arial" w:hAnsi="Arial" w:cs="Arial"/>
+          <w:color w:val="000000"/>
+          <w:sz w:val="32"/>
+          <w:szCs w:val="32"/>
+          <w:shd w:val="clear" w:color="auto" w:fill="FFFFFF"/>
+          <w:lang w:val="en-US"/>
+        </w:rPr>
         <w:t>Zustand</w:t>
       </w:r>
       <w:proofErr w:type="spellEnd"/>
@@ -1282,7 +1477,95 @@
           <w:shd w:val="clear" w:color="auto" w:fill="FFFFFF"/>
           <w:lang w:val="en-US"/>
         </w:rPr>
-        <w:t xml:space="preserve"> Toolkit • SCSS • HTML • CSS • </w:t>
+        <w:t xml:space="preserve"> </w:t>
+      </w:r>
+      <w:r>
+        <w:rPr>
+          <w:rFonts w:ascii="Arial" w:hAnsi="Arial" w:cs="Arial"/>
+          <w:color w:val="000000"/>
+          <w:sz w:val="32"/>
+          <w:szCs w:val="32"/>
+          <w:shd w:val="clear" w:color="auto" w:fill="FFFFFF"/>
+          <w:lang w:val="en-US"/>
+        </w:rPr>
+        <w:t>Toolkit</w:t>
+      </w:r>
+      <w:r>
+        <w:rPr>
+          <w:rFonts w:ascii="Arial" w:hAnsi="Arial" w:cs="Arial"/>
+          <w:color w:val="000000"/>
+          <w:sz w:val="32"/>
+          <w:szCs w:val="32"/>
+          <w:shd w:val="clear" w:color="auto" w:fill="FFFFFF"/>
+          <w:lang w:val="en-US"/>
+        </w:rPr>
+        <w:t xml:space="preserve"> • </w:t>
+      </w:r>
+      <w:r>
+        <w:rPr>
+          <w:rFonts w:ascii="Arial" w:hAnsi="Arial" w:cs="Arial"/>
+          <w:color w:val="000000"/>
+          <w:sz w:val="32"/>
+          <w:szCs w:val="32"/>
+          <w:shd w:val="clear" w:color="auto" w:fill="FFFFFF"/>
+          <w:lang w:val="en-US"/>
+        </w:rPr>
+        <w:t>SCSS</w:t>
+      </w:r>
+      <w:r>
+        <w:rPr>
+          <w:rFonts w:ascii="Arial" w:hAnsi="Arial" w:cs="Arial"/>
+          <w:color w:val="000000"/>
+          <w:sz w:val="32"/>
+          <w:szCs w:val="32"/>
+          <w:shd w:val="clear" w:color="auto" w:fill="FFFFFF"/>
+          <w:lang w:val="en-US"/>
+        </w:rPr>
+        <w:t xml:space="preserve"> • </w:t>
+      </w:r>
+      <w:r>
+        <w:rPr>
+          <w:rFonts w:ascii="Arial" w:hAnsi="Arial" w:cs="Arial"/>
+          <w:color w:val="000000"/>
+          <w:sz w:val="32"/>
+          <w:szCs w:val="32"/>
+          <w:shd w:val="clear" w:color="auto" w:fill="FFFFFF"/>
+          <w:lang w:val="en-US"/>
+        </w:rPr>
+        <w:t>HTML</w:t>
+      </w:r>
+      <w:r>
+        <w:rPr>
+          <w:rFonts w:ascii="Arial" w:hAnsi="Arial" w:cs="Arial"/>
+          <w:color w:val="000000"/>
+          <w:sz w:val="32"/>
+          <w:szCs w:val="32"/>
+          <w:shd w:val="clear" w:color="auto" w:fill="FFFFFF"/>
+          <w:lang w:val="en-US"/>
+        </w:rPr>
+        <w:t xml:space="preserve"> • </w:t>
+      </w:r>
+      <w:r>
+        <w:rPr>
+          <w:rFonts w:ascii="Arial" w:hAnsi="Arial" w:cs="Arial"/>
+          <w:color w:val="000000"/>
+          <w:sz w:val="32"/>
+          <w:szCs w:val="32"/>
+          <w:shd w:val="clear" w:color="auto" w:fill="FFFFFF"/>
+          <w:lang w:val="en-US"/>
+        </w:rPr>
+        <w:t>CSS</w:t>
+      </w:r>
+      <w:r>
+        <w:rPr>
+          <w:rFonts w:ascii="Arial" w:hAnsi="Arial" w:cs="Arial"/>
+          <w:color w:val="000000"/>
+          <w:sz w:val="32"/>
+          <w:szCs w:val="32"/>
+          <w:shd w:val="clear" w:color="auto" w:fill="FFFFFF"/>
+          <w:lang w:val="en-US"/>
+        </w:rPr>
+        <w:t xml:space="preserve"> • </w:t>
       </w:r>
       <w:proofErr w:type="spellStart"/>
       <w:r>
@@ -1339,32 +1622,6 @@
           <w:sz w:val="32"/>
           <w:szCs w:val="32"/>
           <w:shd w:val="clear" w:color="auto" w:fill="FFFFFF"/>
-          <w:lang w:val="en-US"/>
-        </w:rPr>
-      </w:pPr>
-    </w:p>
-    <w:p>
-      <w:pPr>
-        <w:pStyle w:val="a3"/>
-        <w:spacing w:after="0"/>
-        <w:textAlignment w:val="baseline"/>
-        <w:rPr>
-          <w:rFonts w:ascii="Arial" w:hAnsi="Arial" w:cs="Arial"/>
-          <w:sz w:val="32"/>
-          <w:szCs w:val="32"/>
-          <w:lang w:val="en-US"/>
-        </w:rPr>
-      </w:pPr>
-    </w:p>
-    <w:p>
-      <w:pPr>
-        <w:pStyle w:val="a3"/>
-        <w:spacing w:after="0"/>
-        <w:textAlignment w:val="baseline"/>
-        <w:rPr>
-          <w:rFonts w:ascii="Arial" w:hAnsi="Arial" w:cs="Arial"/>
-          <w:sz w:val="32"/>
-          <w:szCs w:val="32"/>
           <w:lang w:val="en-US"/>
         </w:rPr>
       </w:pPr>
@@ -1396,6 +1653,32 @@
           <w:lang w:val="en-US"/>
         </w:rPr>
       </w:pPr>
+    </w:p>
+    <w:p>
+      <w:pPr>
+        <w:pStyle w:val="a3"/>
+        <w:spacing w:after="0"/>
+        <w:textAlignment w:val="baseline"/>
+        <w:rPr>
+          <w:rFonts w:ascii="Arial" w:hAnsi="Arial" w:cs="Arial"/>
+          <w:sz w:val="32"/>
+          <w:szCs w:val="32"/>
+          <w:lang w:val="en-US"/>
+        </w:rPr>
+      </w:pPr>
+    </w:p>
+    <w:p>
+      <w:pPr>
+        <w:pStyle w:val="a3"/>
+        <w:spacing w:after="0"/>
+        <w:textAlignment w:val="baseline"/>
+        <w:rPr>
+          <w:rFonts w:ascii="Arial" w:hAnsi="Arial" w:cs="Arial"/>
+          <w:sz w:val="32"/>
+          <w:szCs w:val="32"/>
+          <w:lang w:val="en-US"/>
+        </w:rPr>
+      </w:pPr>
       <w:r>
         <w:rPr>
           <w:rFonts w:ascii="Arial" w:hAnsi="Arial" w:cs="Arial"/>
@@ -1951,7 +2234,40 @@
           <w:szCs w:val="32"/>
           <w:lang w:val="en-US"/>
         </w:rPr>
-        <w:t xml:space="preserve"> (top 0.8%). I work with React, JavaScript, </w:t>
+        <w:t xml:space="preserve"> (top 0.8%). I work with React, </w:t>
+      </w:r>
+      <w:proofErr w:type="spellStart"/>
+      <w:r>
+        <w:rPr>
+          <w:rFonts w:ascii="Arial" w:hAnsi="Arial" w:cs="Arial"/>
+          <w:color w:val="000000"/>
+          <w:sz w:val="32"/>
+          <w:szCs w:val="32"/>
+          <w:shd w:val="clear" w:color="auto" w:fill="FFFFFF"/>
+          <w:lang w:val="en-US"/>
+        </w:rPr>
+        <w:t>Vite</w:t>
+      </w:r>
+      <w:proofErr w:type="spellEnd"/>
+      <w:r>
+        <w:rPr>
+          <w:rFonts w:ascii="Arial" w:hAnsi="Arial" w:cs="Arial"/>
+          <w:color w:val="000000"/>
+          <w:sz w:val="32"/>
+          <w:szCs w:val="32"/>
+          <w:shd w:val="clear" w:color="auto" w:fill="FFFFFF"/>
+          <w:lang w:val="en-US"/>
+        </w:rPr>
+        <w:t xml:space="preserve">, </w:t>
+      </w:r>
+      <w:r>
+        <w:rPr>
+          <w:rFonts w:ascii="Arial" w:hAnsi="Arial" w:cs="Arial"/>
+          <w:sz w:val="32"/>
+          <w:szCs w:val="32"/>
+          <w:lang w:val="en-US"/>
+        </w:rPr>
+        <w:t xml:space="preserve">JavaScript, </w:t>
       </w:r>
       <w:proofErr w:type="spellStart"/>
       <w:r>
@@ -2068,7 +2384,51 @@
           <w:szCs w:val="32"/>
           <w:lang w:val="en-US"/>
         </w:rPr>
-        <w:t xml:space="preserve">React • JavaScript • </w:t>
+        <w:t xml:space="preserve">React </w:t>
+      </w:r>
+      <w:r>
+        <w:rPr>
+          <w:rFonts w:ascii="Arial" w:hAnsi="Arial" w:cs="Arial"/>
+          <w:color w:val="000000"/>
+          <w:sz w:val="32"/>
+          <w:szCs w:val="32"/>
+          <w:shd w:val="clear" w:color="auto" w:fill="FFFFFF"/>
+          <w:lang w:val="en-US"/>
+        </w:rPr>
+        <w:t xml:space="preserve">• </w:t>
+      </w:r>
+      <w:proofErr w:type="spellStart"/>
+      <w:r>
+        <w:rPr>
+          <w:rFonts w:ascii="Arial" w:hAnsi="Arial" w:cs="Arial"/>
+          <w:color w:val="000000"/>
+          <w:sz w:val="32"/>
+          <w:szCs w:val="32"/>
+          <w:shd w:val="clear" w:color="auto" w:fill="FFFFFF"/>
+          <w:lang w:val="en-US"/>
+        </w:rPr>
+        <w:t>Vite</w:t>
+      </w:r>
+      <w:proofErr w:type="spellEnd"/>
+      <w:r>
+        <w:rPr>
+          <w:rFonts w:ascii="Arial" w:hAnsi="Arial" w:cs="Arial"/>
+          <w:color w:val="000000"/>
+          <w:sz w:val="32"/>
+          <w:szCs w:val="32"/>
+          <w:shd w:val="clear" w:color="auto" w:fill="FFFFFF"/>
+          <w:lang w:val="en-US"/>
+        </w:rPr>
+        <w:t xml:space="preserve"> </w:t>
+      </w:r>
+      <w:r>
+        <w:rPr>
+          <w:rFonts w:ascii="Arial" w:hAnsi="Arial" w:cs="Arial"/>
+          <w:sz w:val="32"/>
+          <w:szCs w:val="32"/>
+          <w:lang w:val="en-US"/>
+        </w:rPr>
+        <w:t xml:space="preserve">• JavaScript • </w:t>
       </w:r>
       <w:proofErr w:type="spellStart"/>
       <w:r>
@@ -2089,6 +2449,109 @@
           <w:lang w:val="en-US"/>
         </w:rPr>
         <w:t xml:space="preserve"> • </w:t>
+      </w:r>
+      <w:proofErr w:type="spellStart"/>
+      <w:r>
+        <w:rPr>
+          <w:rFonts w:ascii="Arial" w:hAnsi="Arial" w:cs="Arial"/>
+          <w:color w:val="000000"/>
+          <w:sz w:val="32"/>
+          <w:szCs w:val="32"/>
+          <w:shd w:val="clear" w:color="auto" w:fill="FFFFFF"/>
+          <w:lang w:val="en-US"/>
+        </w:rPr>
+        <w:t>Zod</w:t>
+      </w:r>
+      <w:proofErr w:type="spellEnd"/>
+      <w:r>
+        <w:rPr>
+          <w:rFonts w:ascii="Arial" w:hAnsi="Arial" w:cs="Arial"/>
+          <w:color w:val="000000"/>
+          <w:sz w:val="32"/>
+          <w:szCs w:val="32"/>
+          <w:shd w:val="clear" w:color="auto" w:fill="FFFFFF"/>
+          <w:lang w:val="en-US"/>
+        </w:rPr>
+        <w:t xml:space="preserve"> </w:t>
+      </w:r>
+      <w:r>
+        <w:rPr>
+          <w:rFonts w:ascii="Arial" w:hAnsi="Arial" w:cs="Arial"/>
+          <w:color w:val="000000"/>
+          <w:sz w:val="32"/>
+          <w:szCs w:val="32"/>
+          <w:shd w:val="clear" w:color="auto" w:fill="FFFFFF"/>
+          <w:lang w:val="en-US"/>
+        </w:rPr>
+        <w:t>•</w:t>
+      </w:r>
+      <w:r>
+        <w:rPr>
+          <w:rFonts w:ascii="Arial" w:hAnsi="Arial" w:cs="Arial"/>
+          <w:color w:val="000000"/>
+          <w:sz w:val="32"/>
+          <w:szCs w:val="32"/>
+          <w:shd w:val="clear" w:color="auto" w:fill="FFFFFF"/>
+          <w:lang w:val="en-US"/>
+        </w:rPr>
+        <w:t xml:space="preserve"> </w:t>
+      </w:r>
+      <w:proofErr w:type="spellStart"/>
+      <w:r>
+        <w:rPr>
+          <w:rFonts w:ascii="Arial" w:hAnsi="Arial" w:cs="Arial"/>
+          <w:color w:val="000000"/>
+          <w:sz w:val="32"/>
+          <w:szCs w:val="32"/>
+          <w:shd w:val="clear" w:color="auto" w:fill="FFFFFF"/>
+          <w:lang w:val="en-US"/>
+        </w:rPr>
+        <w:t>TanStack</w:t>
+      </w:r>
+      <w:proofErr w:type="spellEnd"/>
+      <w:r>
+        <w:rPr>
+          <w:rFonts w:ascii="Arial" w:hAnsi="Arial" w:cs="Arial"/>
+          <w:color w:val="000000"/>
+          <w:sz w:val="32"/>
+          <w:szCs w:val="32"/>
+          <w:shd w:val="clear" w:color="auto" w:fill="FFFFFF"/>
+          <w:lang w:val="en-US"/>
+        </w:rPr>
+        <w:t xml:space="preserve"> Router</w:t>
+      </w:r>
+      <w:r>
+        <w:rPr>
+          <w:rFonts w:ascii="Arial" w:hAnsi="Arial" w:cs="Arial"/>
+          <w:color w:val="000000"/>
+          <w:sz w:val="32"/>
+          <w:szCs w:val="32"/>
+          <w:shd w:val="clear" w:color="auto" w:fill="FFFFFF"/>
+          <w:lang w:val="en-US"/>
+        </w:rPr>
+        <w:t xml:space="preserve"> </w:t>
+      </w:r>
+      <w:r>
+        <w:rPr>
+          <w:rFonts w:ascii="Arial" w:hAnsi="Arial" w:cs="Arial"/>
+          <w:color w:val="000000"/>
+          <w:sz w:val="32"/>
+          <w:szCs w:val="32"/>
+          <w:shd w:val="clear" w:color="auto" w:fill="FFFFFF"/>
+          <w:lang w:val="en-US"/>
+        </w:rPr>
+        <w:t>•</w:t>
+      </w:r>
+      <w:r>
+        <w:rPr>
+          <w:rFonts w:ascii="Arial" w:hAnsi="Arial" w:cs="Arial"/>
+          <w:color w:val="000000"/>
+          <w:sz w:val="32"/>
+          <w:szCs w:val="32"/>
+          <w:shd w:val="clear" w:color="auto" w:fill="FFFFFF"/>
+          <w:lang w:val="en-US"/>
+        </w:rPr>
+        <w:t xml:space="preserve"> </w:t>
       </w:r>
       <w:proofErr w:type="spellStart"/>
       <w:r>

</xml_diff>